<commit_message>
build(manuscripts): synchronize all FA and EN .docx and .doc files with latest LTR and reviewer updates
</commit_message>
<xml_diff>
--- a/From_Transactional_Data_to_Organizational_Intelligence.docx
+++ b/From_Transactional_Data_to_Organizational_Intelligence.docx
@@ -366,7 +366,7 @@
       <w:r>
         <w:drawing>
           <wp:inline xmlns:a="http://schemas.openxmlformats.org/drawingml/2006/main" xmlns:pic="http://schemas.openxmlformats.org/drawingml/2006/picture">
-            <wp:extent cx="2834640" cy="1120847"/>
+            <wp:extent cx="2834640" cy="730286"/>
             <wp:docPr id="1" name="Picture 1"/>
             <wp:cNvGraphicFramePr>
               <a:graphicFrameLocks noChangeAspect="1"/>
@@ -387,7 +387,7 @@
                   <pic:spPr>
                     <a:xfrm>
                       <a:off x="0" y="0"/>
-                      <a:ext cx="2834640" cy="1120847"/>
+                      <a:ext cx="2834640" cy="730286"/>
                     </a:xfrm>
                     <a:prstGeom prst="rect"/>
                   </pic:spPr>
@@ -753,7 +753,7 @@
       <w:r>
         <w:drawing>
           <wp:inline xmlns:a="http://schemas.openxmlformats.org/drawingml/2006/main" xmlns:pic="http://schemas.openxmlformats.org/drawingml/2006/picture">
-            <wp:extent cx="2834640" cy="2380762"/>
+            <wp:extent cx="2834640" cy="1545231"/>
             <wp:docPr id="2" name="Picture 2"/>
             <wp:cNvGraphicFramePr>
               <a:graphicFrameLocks noChangeAspect="1"/>
@@ -774,7 +774,7 @@
                   <pic:spPr>
                     <a:xfrm>
                       <a:off x="0" y="0"/>
-                      <a:ext cx="2834640" cy="2380762"/>
+                      <a:ext cx="2834640" cy="1545231"/>
                     </a:xfrm>
                     <a:prstGeom prst="rect"/>
                   </pic:spPr>
@@ -1335,7 +1335,7 @@
       <w:r>
         <w:drawing>
           <wp:inline xmlns:a="http://schemas.openxmlformats.org/drawingml/2006/main" xmlns:pic="http://schemas.openxmlformats.org/drawingml/2006/picture">
-            <wp:extent cx="2834640" cy="1735808"/>
+            <wp:extent cx="2834640" cy="1120305"/>
             <wp:docPr id="3" name="Picture 3"/>
             <wp:cNvGraphicFramePr>
               <a:graphicFrameLocks noChangeAspect="1"/>
@@ -1356,7 +1356,7 @@
                   <pic:spPr>
                     <a:xfrm>
                       <a:off x="0" y="0"/>
-                      <a:ext cx="2834640" cy="1735808"/>
+                      <a:ext cx="2834640" cy="1120305"/>
                     </a:xfrm>
                     <a:prstGeom prst="rect"/>
                   </pic:spPr>
@@ -3148,7 +3148,7 @@
       <w:r>
         <w:drawing>
           <wp:inline xmlns:a="http://schemas.openxmlformats.org/drawingml/2006/main" xmlns:pic="http://schemas.openxmlformats.org/drawingml/2006/picture">
-            <wp:extent cx="2834640" cy="1059411"/>
+            <wp:extent cx="2834640" cy="1430738"/>
             <wp:docPr id="4" name="Picture 4"/>
             <wp:cNvGraphicFramePr>
               <a:graphicFrameLocks noChangeAspect="1"/>
@@ -3169,7 +3169,7 @@
                   <pic:spPr>
                     <a:xfrm>
                       <a:off x="0" y="0"/>
-                      <a:ext cx="2834640" cy="1059411"/>
+                      <a:ext cx="2834640" cy="1430738"/>
                     </a:xfrm>
                     <a:prstGeom prst="rect"/>
                   </pic:spPr>
@@ -8582,7 +8582,7 @@
       <w:r>
         <w:drawing>
           <wp:inline xmlns:a="http://schemas.openxmlformats.org/drawingml/2006/main" xmlns:pic="http://schemas.openxmlformats.org/drawingml/2006/picture">
-            <wp:extent cx="2834640" cy="1557056"/>
+            <wp:extent cx="2834640" cy="1300003"/>
             <wp:docPr id="5" name="Picture 5"/>
             <wp:cNvGraphicFramePr>
               <a:graphicFrameLocks noChangeAspect="1"/>
@@ -8603,7 +8603,7 @@
                   <pic:spPr>
                     <a:xfrm>
                       <a:off x="0" y="0"/>
-                      <a:ext cx="2834640" cy="1557056"/>
+                      <a:ext cx="2834640" cy="1300003"/>
                     </a:xfrm>
                     <a:prstGeom prst="rect"/>
                   </pic:spPr>

</xml_diff>